<commit_message>
feat(observaciones): el boton Exportar ahora muestra que esta trabajando
Un export es una navegacion, no un fetch: cuando la respuesta es un archivo el
navegador no dispara ningun evento y la pagina queda identica. Con el ZIP de
adjuntos eso son 60 segundos de boton aparentemente muerto, que es el sintoma
que reporto Vicente.

La unica senal que deja el navegador al empezar una descarga es una cookie: el
JS manda un token en la URL y el controlador lo devuelve en `gore_export_ready`
por cabecera, o sea apenas el archivo esta armado y antes de transferir los
330 MB. Va exenta de EncryptCookies porque el JS tiene que poder compararla con
su token.

Co-Authored-By: Claude Opus 5 <noreply@anthropic.com>
</commit_message>
<xml_diff>
--- a/docs/tecnica/02-manual-administrador.docx
+++ b/docs/tecnica/02-manual-administrador.docx
@@ -9003,6 +9003,60 @@
           <w:szCs w:val="21"/>
         </w:rPr>
         <w:t xml:space="preserve">. Si el filtro activo supera ese límite, la plataforma lo avisa en pantalla y basta con acotar por rango de fechas y bajarlo en dos tandas.</w:t>
+      </w:r>
+    </w:p>
+    <w:p>
+      <w:pPr>
+        <w:spacing w:after="140" w:line="276"/>
+        <w:jc w:val="both"/>
+      </w:pPr>
+      <w:r>
+        <w:rPr>
+          <w:b/>
+          <w:bCs/>
+          <w:sz w:val="21"/>
+          <w:szCs w:val="21"/>
+        </w:rPr>
+        <w:t xml:space="preserve">El ZIP no se descarga al instante.</w:t>
+      </w:r>
+      <w:r>
+        <w:rPr>
+          <w:sz w:val="21"/>
+          <w:szCs w:val="21"/>
+        </w:rPr>
+        <w:t xml:space="preserve"> El archivo se arma en el servidor —se baja cada adjunto y se empaqueta— y con el volumen actual eso toma cerca de un minuto. Mientras tanto el botón muestra </w:t>
+      </w:r>
+      <w:r>
+        <w:rPr>
+          <w:i/>
+          <w:iCs/>
+          <w:sz w:val="21"/>
+          <w:szCs w:val="21"/>
+        </w:rPr>
+        <w:t xml:space="preserve">Preparando…</w:t>
+      </w:r>
+      <w:r>
+        <w:rPr>
+          <w:sz w:val="21"/>
+          <w:szCs w:val="21"/>
+        </w:rPr>
+        <w:t xml:space="preserve"> con un indicador de progreso y queda deshabilitado, y arriba del listado aparece un aviso azul. La descarga recién comienza cuando ese aviso desaparece; ahí toma el control el navegador y aparece su propia barra de progreso. </w:t>
+      </w:r>
+      <w:r>
+        <w:rPr>
+          <w:b/>
+          <w:bCs/>
+          <w:sz w:val="21"/>
+          <w:szCs w:val="21"/>
+        </w:rPr>
+        <w:t xml:space="preserve">No hay que volver a hacer clic ni recargar la página</w:t>
+      </w:r>
+      <w:r>
+        <w:rPr>
+          <w:sz w:val="21"/>
+          <w:szCs w:val="21"/>
+        </w:rPr>
+        <w:t xml:space="preserve"> mientras el aviso esté visible: un segundo clic no acelera nada y obliga al servidor a rehacer el trabajo desde cero.</w:t>
       </w:r>
     </w:p>
     <w:p>

</xml_diff>